<commit_message>
Update Product Requirements and Engineering Reference for shipped features
Family_Recipe_Book_Product_Requirements.docx:
- Correct REC-001: Personal Cookbook is no longer auto-created at account
  creation; it's created explicitly via the Getting Started flow.
- Add REC-010 (chapter/section icon catalog + placeholder), REC-011
  (ingredient quantity-range parsing on import), and COOK-005 (standalone
  conversion tool).

Reusable App Stack - Engineering Reference.pdf:
- Append an addendum covering cross-project lessons from the Cookbook
  build: Firestore list-query rules needing every checked filter present
  in the query itself, Cloud Storage rules requiring the Storage SDK
  (not a raw URLSession) for authenticated downloads, the Spark plan's
  separate Cloud Storage limitation, the save-time photo downscale
  pattern, and GeometryReader-based orientation-aware layout.
</commit_message>
<xml_diff>
--- a/ProductDocumentation/Family_Recipe_Book_Product_Requirements.docx
+++ b/ProductDocumentation/Family_Recipe_Book_Product_Requirements.docx
@@ -5333,7 +5333,7 @@
     </w:p>
     <w:p>
       <w:r>
-        <w:t>Every account has exactly one canonical Personal Cookbook, created automatically and not deletable independently of the account.</w:t>
+        <w:t>Every account has exactly one canonical Personal Cookbook. It is not created automatically at account creation; a Getting Started prompt on Home guides the user to create it explicitly on first use. It is not deletable independently of the account.</w:t>
       </w:r>
     </w:p>
     <w:p>
@@ -5443,6 +5443,34 @@
     </w:p>
     <w:p>
       <w:pPr>
+        <w:pStyle w:val="RequirementID"/>
+      </w:pPr>
+      <w:r>
+        <w:t>REC-010 · SHOULD</w:t>
+      </w:r>
+    </w:p>
+    <w:p>
+      <w:pPr/>
+      <w:r>
+        <w:t>Cookbook sections/chapters may be assigned an icon from a curated built-in catalog (black-and-white and full-color variants). A recipe with no hero photo displays its chapter's icon as a placeholder instead of a generic utensil icon.</w:t>
+      </w:r>
+    </w:p>
+    <w:p>
+      <w:pPr>
+        <w:pStyle w:val="RequirementID"/>
+      </w:pPr>
+      <w:r>
+        <w:t>REC-011 · SHOULD</w:t>
+      </w:r>
+    </w:p>
+    <w:p>
+      <w:pPr/>
+      <w:r>
+        <w:t>Ingredient quantities expressed as a range during import or manual entry (for example, “1/4 to 1/2 tsp”) are captured using the lower value as the ingredient's quantity/unit, with the upper value preserved as an alternative note on the ingredient rather than being dropped.</w:t>
+      </w:r>
+    </w:p>
+    <w:p>
+      <w:pPr>
         <w:pStyle w:val="Heading2"/>
       </w:pPr>
       <w:r>
@@ -5560,6 +5588,20 @@
     <w:p>
       <w:r>
         <w:t>tvOS presents recipe overview, ingredient list, step-by-step mode, photos, and timers. Editing, purchasing, invitations, and group administration are unavailable and offer a QR/deep-link handoff.</w:t>
+      </w:r>
+    </w:p>
+    <w:p>
+      <w:pPr>
+        <w:pStyle w:val="RequirementID"/>
+      </w:pPr>
+      <w:r>
+        <w:t>COOK-005 · SHOULD</w:t>
+      </w:r>
+    </w:p>
+    <w:p>
+      <w:pPr/>
+      <w:r>
+        <w:t>Provide a standalone unit conversion tool (volume, weight, temperature) accessible independent of any single recipe, for ad hoc conversions while cooking.</w:t>
       </w:r>
     </w:p>
     <w:p>

</xml_diff>

<commit_message>
Allow Annual Pro Membership in PRD PAY-007, fix tvOS/rating accessibility gaps, add CI workflow
- PAY-007 now explicitly permits the Annual Pro Membership as a disclosed
  auto-renewing subscription, distinct from the lifetime Family User
  one-time purchase; new product row added to the 4.1 Products table.
- PotluckStepper's tvOS -/+ buttons and GroupCookbookView's star rating
  buttons were the only icon-only controls in the app missing
  accessibility labels, found via a full pass over every
  Image(systemName:) usage in Views — fixed both.
- Add .github/workflows/ios-build-test.yml: build + cookbookTests on
  GitHub-hosted macOS runners, gated on two repo secrets
  (GOOGLE_SERVICE_INFO_PLIST_BASE64, SECRETS_PLIST_BASE64) that still
  need to be added before it can run.

Co-Authored-By: Claude Sonnet 5 <noreply@anthropic.com>
</commit_message>
<xml_diff>
--- a/ProductDocumentation/Family_Recipe_Book_Product_Requirements.docx
+++ b/ProductDocumentation/Family_Recipe_Book_Product_Requirements.docx
@@ -3747,6 +3747,48 @@
                 <w:sz w:val="18"/>
               </w:rPr>
               <w:t>Lifetime ability for the account to join and participate in unlimited groups; purchase is restored on eligible devices/platform account.</w:t>
+            </w:r>
+          </w:p>
+        </w:tc>
+      </w:tr>
+      <w:tr>
+        <w:tc>
+          <w:tcPr>
+            <w:tcW w:type="dxa" w:w="2016"/>
+          </w:tcPr>
+          <w:p>
+            <w:r>
+              <w:t>Annual Pro Membership</w:t>
+            </w:r>
+          </w:p>
+        </w:tc>
+        <w:tc>
+          <w:tcPr>
+            <w:tcW w:type="dxa" w:w="2088"/>
+          </w:tcPr>
+          <w:p>
+            <w:r>
+              <w:t>Auto-renewing subscription (StoreKit 2)</w:t>
+            </w:r>
+          </w:p>
+        </w:tc>
+        <w:tc>
+          <w:tcPr>
+            <w:tcW w:type="dxa" w:w="1800"/>
+          </w:tcPr>
+          <w:p>
+            <w:r>
+              <w:t>Reference price TBD at App Store Connect setup; not hard-coded per PAY-002</w:t>
+            </w:r>
+          </w:p>
+        </w:tc>
+        <w:tc>
+          <w:tcPr>
+            <w:tcW w:type="dxa" w:w="3456"/>
+          </w:tcPr>
+          <w:p>
+            <w:r>
+              <w:t>Time-limited alternative to Family User: grants the same ability to join and participate in unlimited groups for the active subscription term. Auto-renews unless cancelled; restored via Restore Purchases. Does not consume or replace a Family User lifetime purchase — a separate, optional entitlement path for members who prefer year-to-year billing over a lifetime unlock.</w:t>
             </w:r>
           </w:p>
         </w:tc>
@@ -5217,7 +5259,7 @@
     </w:p>
     <w:p>
       <w:r>
-        <w:t>Do not call the products “PRO subscription.” Use “Lifetime Family Access” and “Create one group,” followed by “one-time purchase; no subscription.”</w:t>
+        <w:t>Do not call the lifetime Family User or Create-a-Family products a "subscription"; both remain one-time purchases (non-consumable / consumable-credit respectively), consistent with "Lifetime Family Access" and "one-time purchase; no subscription" language. Family Recipe Book additionally offers an Annual Pro Membership — an explicit, auto-renewing StoreKit 2 subscription granting the same group participation rights as Family User for the active term. Wherever this product is offered or purchased, disclose price, renewal term, and cancellation terms per store subscription guidelines; it must never be described using lifetime/one-time language, and the lifetime Family User product must remain available and undiminished as the no-subscription option.</w:t>
       </w:r>
     </w:p>
     <w:p>

</xml_diff>